<commit_message>
1016158: Modified template file
</commit_message>
<xml_diff>
--- a/Offer-Letter-Automation/Offer-Letter-Automation/wwwroot/Data/Template.docx
+++ b/Offer-Letter-Automation/Offer-Letter-Automation/wwwroot/Data/Template.docx
@@ -72,8 +72,8 @@
         <w:tblLook w:val="01E0" w:firstRow="1" w:lastRow="1" w:firstColumn="1" w:lastColumn="1" w:noHBand="0" w:noVBand="0"/>
       </w:tblPr>
       <w:tblGrid>
-        <w:gridCol w:w="5509"/>
-        <w:gridCol w:w="5057"/>
+        <w:gridCol w:w="5489"/>
+        <w:gridCol w:w="5077"/>
       </w:tblGrid>
       <w:tr>
         <w:trPr>
@@ -246,29 +246,12 @@
           <w:p>
             <w:pPr>
               <w:spacing w:after="60"/>
+              <w:ind w:left="1440"/>
               <w:rPr>
                 <w:rFonts w:ascii="Bitstream Vera Serif" w:hAnsi="Bitstream Vera Serif"/>
                 <w:szCs w:val="20"/>
               </w:rPr>
             </w:pPr>
-          </w:p>
-          <w:p>
-            <w:pPr>
-              <w:spacing w:after="60"/>
-              <w:rPr>
-                <w:rFonts w:ascii="Bitstream Vera Serif" w:hAnsi="Bitstream Vera Serif"/>
-                <w:szCs w:val="20"/>
-              </w:rPr>
-            </w:pPr>
-            <w:r>
-              <w:rPr>
-                <w:rFonts w:ascii="Bitstream Vera Serif" w:hAnsi="Bitstream Vera Serif"/>
-                <w:b/>
-                <w:color w:val="000080"/>
-                <w:szCs w:val="20"/>
-              </w:rPr>
-              <w:t xml:space="preserve">                       </w:t>
-            </w:r>
           </w:p>
         </w:tc>
       </w:tr>
@@ -312,27 +295,6 @@
                 <w:sz w:val="32"/>
               </w:rPr>
             </w:pPr>
-          </w:p>
-          <w:p>
-            <w:pPr>
-              <w:rPr>
-                <w:rFonts w:ascii="Arial" w:hAnsi="Arial" w:cs="Arial"/>
-                <w:b/>
-                <w:i/>
-                <w:color w:val="000080"/>
-                <w:sz w:val="32"/>
-              </w:rPr>
-            </w:pPr>
-            <w:r>
-              <w:rPr>
-                <w:rFonts w:ascii="Arial" w:hAnsi="Arial" w:cs="Arial"/>
-                <w:b/>
-                <w:i/>
-                <w:color w:val="000080"/>
-                <w:sz w:val="32"/>
-              </w:rPr>
-              <w:t xml:space="preserve"> </w:t>
-            </w:r>
             <w:r>
               <w:rPr>
                 <w:rFonts w:ascii="Arial" w:hAnsi="Arial" w:cs="Arial"/>
@@ -544,6 +506,14 @@
                 <w:szCs w:val="20"/>
                 <w:lang w:val="fr-FR"/>
               </w:rPr>
+              <w:t xml:space="preserve">  </w:t>
+            </w:r>
+            <w:r>
+              <w:rPr>
+                <w:rFonts w:ascii="Bitstream Vera Serif" w:hAnsi="Bitstream Vera Serif"/>
+                <w:szCs w:val="20"/>
+                <w:lang w:val="fr-FR"/>
+              </w:rPr>
               <w:t>1-919-481-1974.</w:t>
             </w:r>
           </w:p>
@@ -579,6 +549,14 @@
                 <w:szCs w:val="20"/>
                 <w:lang w:val="fr-FR"/>
               </w:rPr>
+              <w:t xml:space="preserve">    </w:t>
+            </w:r>
+            <w:r>
+              <w:rPr>
+                <w:rFonts w:ascii="Bitstream Vera Serif" w:hAnsi="Bitstream Vera Serif"/>
+                <w:szCs w:val="20"/>
+                <w:lang w:val="fr-FR"/>
+              </w:rPr>
               <w:t>:</w:t>
             </w:r>
             <w:r>
@@ -610,7 +588,6 @@
                 <w:lang w:val="fr-FR"/>
               </w:rPr>
             </w:pPr>
-            <w:proofErr w:type="gramStart"/>
             <w:r>
               <w:rPr>
                 <w:rFonts w:ascii="Bitstream Vera Serif" w:hAnsi="Bitstream Vera Serif"/>
@@ -619,7 +596,6 @@
               </w:rPr>
               <w:t>Email</w:t>
             </w:r>
-            <w:proofErr w:type="gramEnd"/>
             <w:r>
               <w:rPr>
                 <w:rFonts w:ascii="Bitstream Vera Serif" w:hAnsi="Bitstream Vera Serif"/>
@@ -635,7 +611,7 @@
                 <w:szCs w:val="20"/>
                 <w:lang w:val="fr-FR"/>
               </w:rPr>
-              <w:t xml:space="preserve">: </w:t>
+              <w:t>:</w:t>
             </w:r>
             <w:hyperlink r:id="rId8" w:history="1">
               <w:r>
@@ -659,6 +635,16 @@
           <w:lang w:val="fr-FR"/>
         </w:rPr>
       </w:pPr>
+      <w:r>
+        <w:rPr>
+          <w:rFonts w:ascii="Bitstream Vera Serif" w:hAnsi="Bitstream Vera Serif"/>
+          <w:noProof/>
+          <w:szCs w:val="20"/>
+        </w:rPr>
+        <w:pict w14:anchorId="0A8C3F58">
+          <v:rect id="_x0000_i1025" style="width:498.95pt;height:1.6pt;mso-position-horizontal:absolute;mso-position-horizontal-relative:text;mso-position-vertical:absolute;mso-position-vertical-relative:text" o:hrpct="990" o:hralign="center" o:hrstd="t" o:hr="t" fillcolor="#a0a0a0" stroked="f"/>
+        </w:pict>
+      </w:r>
     </w:p>
     <w:p>
       <w:pPr>
@@ -667,34 +653,6 @@
           <w:lang w:val="fr-FR"/>
         </w:rPr>
       </w:pPr>
-      <w:r>
-        <w:rPr>
-          <w:noProof/>
-        </w:rPr>
-        <w:pict w14:anchorId="627EEAFA">
-          <v:shapetype id="_x0000_t202" coordsize="21600,21600" o:spt="202" path="m,l,21600r21600,l21600,xe">
-            <v:stroke joinstyle="miter"/>
-            <v:path gradientshapeok="t" o:connecttype="rect"/>
-          </v:shapetype>
-          <v:shape id="Text Box 2" o:spid="_x0000_s1026" type="#_x0000_t202" style="position:absolute;margin-left:350.6pt;margin-top:.85pt;width:120pt;height:110pt;z-index:251659264;visibility:visible;mso-wrap-distance-left:9pt;mso-wrap-distance-top:3.6pt;mso-wrap-distance-right:9pt;mso-wrap-distance-bottom:3.6pt;mso-position-horizontal-relative:text;mso-position-vertical-relative:text;mso-width-relative:margin;mso-height-relative:margin;v-text-anchor:top">
-            <v:textbox>
-              <w:txbxContent>
-                <w:p>
-                  <w:fldSimple w:instr=" MERGEFIELD  Image:Photo \* FirstCap  \* MERGEFORMAT ">
-                    <w:r>
-                      <w:rPr>
-                        <w:noProof/>
-                      </w:rPr>
-                      <w:t>«Image:Photo»</w:t>
-                    </w:r>
-                  </w:fldSimple>
-                </w:p>
-              </w:txbxContent>
-            </v:textbox>
-            <w10:wrap type="square"/>
-          </v:shape>
-        </w:pict>
-      </w:r>
       <w:r>
         <w:rPr>
           <w:rFonts w:ascii="Bitstream Vera Serif" w:hAnsi="Bitstream Vera Serif"/>
@@ -710,11 +668,116 @@
           <w:tab w:val="left" w:pos="1440"/>
           <w:tab w:val="left" w:pos="6165"/>
         </w:tabs>
-        <w:rPr>
-          <w:rFonts w:ascii="Bitstream Vera Serif" w:hAnsi="Bitstream Vera Serif"/>
-          <w:szCs w:val="20"/>
-        </w:rPr>
-      </w:pPr>
+        <w:spacing w:line="360" w:lineRule="auto"/>
+        <w:rPr>
+          <w:rFonts w:ascii="Bitstream Vera Serif" w:hAnsi="Bitstream Vera Serif"/>
+          <w:szCs w:val="20"/>
+        </w:rPr>
+      </w:pPr>
+      <w:r>
+        <w:rPr>
+          <w:noProof/>
+        </w:rPr>
+        <mc:AlternateContent>
+          <mc:Choice Requires="wps">
+            <w:drawing>
+              <wp:anchor distT="45720" distB="45720" distL="114300" distR="114300" simplePos="0" relativeHeight="251659264" behindDoc="0" locked="0" layoutInCell="1" allowOverlap="1" wp14:anchorId="627EEAFA" wp14:editId="13F59CD0">
+                <wp:simplePos x="0" y="0"/>
+                <wp:positionH relativeFrom="column">
+                  <wp:posOffset>4505960</wp:posOffset>
+                </wp:positionH>
+                <wp:positionV relativeFrom="paragraph">
+                  <wp:posOffset>10795</wp:posOffset>
+                </wp:positionV>
+                <wp:extent cx="1524000" cy="1397000"/>
+                <wp:effectExtent l="10160" t="9525" r="8890" b="12700"/>
+                <wp:wrapSquare wrapText="bothSides"/>
+                <wp:docPr id="1465020758" name="Text Box 2"/>
+                <wp:cNvGraphicFramePr>
+                  <a:graphicFrameLocks xmlns:a="http://schemas.openxmlformats.org/drawingml/2006/main"/>
+                </wp:cNvGraphicFramePr>
+                <a:graphic xmlns:a="http://schemas.openxmlformats.org/drawingml/2006/main">
+                  <a:graphicData uri="http://schemas.microsoft.com/office/word/2010/wordprocessingShape">
+                    <wps:wsp>
+                      <wps:cNvSpPr txBox="1">
+                        <a:spLocks noChangeArrowheads="1"/>
+                      </wps:cNvSpPr>
+                      <wps:spPr bwMode="auto">
+                        <a:xfrm>
+                          <a:off x="0" y="0"/>
+                          <a:ext cx="1524000" cy="1397000"/>
+                        </a:xfrm>
+                        <a:prstGeom prst="rect">
+                          <a:avLst/>
+                        </a:prstGeom>
+                        <a:solidFill>
+                          <a:srgbClr val="FFFFFF"/>
+                        </a:solidFill>
+                        <a:ln w="9525">
+                          <a:solidFill>
+                            <a:srgbClr val="000000"/>
+                          </a:solidFill>
+                          <a:miter lim="800000"/>
+                          <a:headEnd/>
+                          <a:tailEnd/>
+                        </a:ln>
+                      </wps:spPr>
+                      <wps:txbx>
+                        <w:txbxContent>
+                          <w:p>
+                            <w:fldSimple w:instr=" MERGEFIELD  Image:Photo \* FirstCap  \* MERGEFORMAT ">
+                              <w:r>
+                                <w:rPr>
+                                  <w:noProof/>
+                                </w:rPr>
+                                <w:t>«Image:Photo»</w:t>
+                              </w:r>
+                            </w:fldSimple>
+                          </w:p>
+                        </w:txbxContent>
+                      </wps:txbx>
+                      <wps:bodyPr rot="0" vert="horz" wrap="square" lIns="91440" tIns="45720" rIns="91440" bIns="45720" anchor="t" anchorCtr="0" upright="1">
+                        <a:noAutofit/>
+                      </wps:bodyPr>
+                    </wps:wsp>
+                  </a:graphicData>
+                </a:graphic>
+                <wp14:sizeRelH relativeFrom="margin">
+                  <wp14:pctWidth>0</wp14:pctWidth>
+                </wp14:sizeRelH>
+                <wp14:sizeRelV relativeFrom="margin">
+                  <wp14:pctHeight>0</wp14:pctHeight>
+                </wp14:sizeRelV>
+              </wp:anchor>
+            </w:drawing>
+          </mc:Choice>
+          <mc:Fallback>
+            <w:pict>
+              <v:shapetype w14:anchorId="627EEAFA" id="_x0000_t202" coordsize="21600,21600" o:spt="202" path="m,l,21600r21600,l21600,xe">
+                <v:stroke joinstyle="miter"/>
+                <v:path gradientshapeok="t" o:connecttype="rect"/>
+              </v:shapetype>
+              <v:shape id="Text Box 2" o:spid="_x0000_s1026" type="#_x0000_t202" style="position:absolute;margin-left:354.8pt;margin-top:.85pt;width:120pt;height:110pt;z-index:251659264;visibility:visible;mso-wrap-style:square;mso-width-percent:0;mso-height-percent:0;mso-wrap-distance-left:9pt;mso-wrap-distance-top:3.6pt;mso-wrap-distance-right:9pt;mso-wrap-distance-bottom:3.6pt;mso-position-horizontal:absolute;mso-position-horizontal-relative:text;mso-position-vertical:absolute;mso-position-vertical-relative:text;mso-width-percent:0;mso-height-percent:0;mso-width-relative:margin;mso-height-relative:margin;v-text-anchor:top" o:gfxdata="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">
+                <v:textbox>
+                  <w:txbxContent>
+                    <w:p>
+                      <w:fldSimple w:instr=" MERGEFIELD  Image:Photo \* FirstCap  \* MERGEFORMAT ">
+                        <w:r>
+                          <w:rPr>
+                            <w:noProof/>
+                          </w:rPr>
+                          <w:t>«Image:Photo»</w:t>
+                        </w:r>
+                      </w:fldSimple>
+                    </w:p>
+                  </w:txbxContent>
+                </v:textbox>
+                <w10:wrap type="square"/>
+              </v:shape>
+            </w:pict>
+          </mc:Fallback>
+        </mc:AlternateContent>
+      </w:r>
       <w:r>
         <w:rPr>
           <w:rFonts w:ascii="Bitstream Vera Serif" w:hAnsi="Bitstream Vera Serif"/>
@@ -765,6 +828,7 @@
     </w:p>
     <w:p>
       <w:pPr>
+        <w:spacing w:line="360" w:lineRule="auto"/>
         <w:rPr>
           <w:rFonts w:ascii="Bitstream Vera Serif" w:hAnsi="Bitstream Vera Serif"/>
           <w:szCs w:val="20"/>
@@ -820,6 +884,7 @@
     </w:p>
     <w:p>
       <w:pPr>
+        <w:spacing w:line="360" w:lineRule="auto"/>
         <w:rPr>
           <w:rFonts w:ascii="Bitstream Vera Serif" w:hAnsi="Bitstream Vera Serif"/>
           <w:szCs w:val="20"/>
@@ -875,6 +940,7 @@
     </w:p>
     <w:p>
       <w:pPr>
+        <w:spacing w:line="360" w:lineRule="auto"/>
         <w:rPr>
           <w:rFonts w:ascii="Bitstream Vera Serif" w:hAnsi="Bitstream Vera Serif"/>
           <w:szCs w:val="20"/>
@@ -938,6 +1004,7 @@
     </w:p>
     <w:p>
       <w:pPr>
+        <w:spacing w:line="360" w:lineRule="auto"/>
         <w:ind w:firstLine="720"/>
         <w:rPr>
           <w:rFonts w:ascii="Bitstream Vera Serif" w:hAnsi="Bitstream Vera Serif"/>
@@ -950,6 +1017,14 @@
           <w:noProof/>
           <w:szCs w:val="20"/>
         </w:rPr>
+        <w:t xml:space="preserve">Phone : </w:t>
+      </w:r>
+      <w:r>
+        <w:rPr>
+          <w:rFonts w:ascii="Bitstream Vera Serif" w:hAnsi="Bitstream Vera Serif"/>
+          <w:noProof/>
+          <w:szCs w:val="20"/>
+        </w:rPr>
         <w:fldChar w:fldCharType="begin"/>
       </w:r>
       <w:r>
@@ -958,7 +1033,7 @@
           <w:noProof/>
           <w:szCs w:val="20"/>
         </w:rPr>
-        <w:instrText xml:space="preserve"> MERGEFIELD  Country \f .  \* MERGEFORMAT </w:instrText>
+        <w:instrText xml:space="preserve"> MERGEFIELD  Phone  \* MERGEFORMAT </w:instrText>
       </w:r>
       <w:r>
         <w:rPr>
@@ -974,7 +1049,7 @@
           <w:noProof/>
           <w:szCs w:val="20"/>
         </w:rPr>
-        <w:t>«Country».</w:t>
+        <w:t>«Phone»</w:t>
       </w:r>
       <w:r>
         <w:rPr>
@@ -987,18 +1062,26 @@
     </w:p>
     <w:p>
       <w:pPr>
-        <w:spacing w:line="480" w:lineRule="auto"/>
-        <w:rPr>
-          <w:rFonts w:ascii="Bitstream Vera Serif" w:hAnsi="Bitstream Vera Serif"/>
-          <w:szCs w:val="20"/>
-        </w:rPr>
-      </w:pPr>
-      <w:r>
-        <w:rPr>
-          <w:rFonts w:ascii="Bitstream Vera Serif" w:hAnsi="Bitstream Vera Serif"/>
-          <w:szCs w:val="20"/>
-        </w:rPr>
-        <w:tab/>
+        <w:spacing w:line="276" w:lineRule="auto"/>
+        <w:rPr>
+          <w:rFonts w:ascii="Bitstream Vera Serif" w:hAnsi="Bitstream Vera Serif"/>
+          <w:noProof/>
+          <w:szCs w:val="20"/>
+        </w:rPr>
+      </w:pPr>
+      <w:r>
+        <w:rPr>
+          <w:rFonts w:ascii="Bitstream Vera Serif" w:hAnsi="Bitstream Vera Serif"/>
+          <w:szCs w:val="20"/>
+        </w:rPr>
+        <w:t>Dear</w:t>
+      </w:r>
+      <w:r>
+        <w:rPr>
+          <w:rFonts w:ascii="Bitstream Vera Serif" w:hAnsi="Bitstream Vera Serif"/>
+          <w:szCs w:val="20"/>
+        </w:rPr>
+        <w:t xml:space="preserve"> </w:t>
       </w:r>
       <w:r>
         <w:rPr>
@@ -1014,7 +1097,7 @@
           <w:noProof/>
           <w:szCs w:val="20"/>
         </w:rPr>
-        <w:instrText xml:space="preserve"> MERGEFIELD  Phone \b "Phone  :  "  \* MERGEFORMAT </w:instrText>
+        <w:instrText xml:space="preserve"> MERGEFIELD  ContactName  \* MERGEFORMAT </w:instrText>
       </w:r>
       <w:r>
         <w:rPr>
@@ -1030,7 +1113,7 @@
           <w:noProof/>
           <w:szCs w:val="20"/>
         </w:rPr>
-        <w:t>Phone  :  «Phone»</w:t>
+        <w:t>«ContactName»</w:t>
       </w:r>
       <w:r>
         <w:rPr>
@@ -1040,29 +1123,39 @@
         </w:rPr>
         <w:fldChar w:fldCharType="end"/>
       </w:r>
-    </w:p>
-    <w:p>
-      <w:pPr>
-        <w:spacing w:after="100" w:afterAutospacing="1"/>
-        <w:rPr>
-          <w:rFonts w:ascii="Bitstream Vera Serif" w:hAnsi="Bitstream Vera Serif"/>
-          <w:noProof/>
-          <w:szCs w:val="20"/>
-        </w:rPr>
-      </w:pPr>
-      <w:r>
-        <w:rPr>
-          <w:rFonts w:ascii="Bitstream Vera Serif" w:hAnsi="Bitstream Vera Serif"/>
-          <w:szCs w:val="20"/>
-        </w:rPr>
-        <w:t>Dear</w:t>
-      </w:r>
-      <w:r>
-        <w:rPr>
-          <w:rFonts w:ascii="Bitstream Vera Serif" w:hAnsi="Bitstream Vera Serif"/>
-          <w:szCs w:val="20"/>
-        </w:rPr>
-        <w:t xml:space="preserve"> </w:t>
+      <w:r>
+        <w:rPr>
+          <w:rFonts w:ascii="Bitstream Vera Serif" w:hAnsi="Bitstream Vera Serif"/>
+          <w:noProof/>
+          <w:szCs w:val="20"/>
+        </w:rPr>
+        <w:t>,</w:t>
+      </w:r>
+    </w:p>
+    <w:p>
+      <w:pPr>
+        <w:spacing w:after="100" w:afterAutospacing="1" w:line="276" w:lineRule="auto"/>
+        <w:rPr>
+          <w:rFonts w:ascii="Bitstream Vera Serif" w:hAnsi="Bitstream Vera Serif"/>
+          <w:noProof/>
+          <w:szCs w:val="20"/>
+        </w:rPr>
+      </w:pPr>
+      <w:r>
+        <w:rPr>
+          <w:rFonts w:ascii="Bitstream Vera Serif" w:hAnsi="Bitstream Vera Serif"/>
+          <w:noProof/>
+          <w:szCs w:val="20"/>
+        </w:rPr>
+        <w:t xml:space="preserve">We are pleased to offer you the position </w:t>
+      </w:r>
+      <w:r>
+        <w:rPr>
+          <w:rFonts w:ascii="Bitstream Vera Serif" w:hAnsi="Bitstream Vera Serif"/>
+          <w:noProof/>
+          <w:szCs w:val="20"/>
+        </w:rPr>
+        <w:t xml:space="preserve">of </w:t>
       </w:r>
       <w:r>
         <w:rPr>
@@ -1078,7 +1171,7 @@
           <w:noProof/>
           <w:szCs w:val="20"/>
         </w:rPr>
-        <w:instrText xml:space="preserve"> MERGEFIELD  ContactName  \* MERGEFORMAT </w:instrText>
+        <w:instrText xml:space="preserve"> MERGEFIELD  PositionTitle  \* MERGEFORMAT </w:instrText>
       </w:r>
       <w:r>
         <w:rPr>
@@ -1094,7 +1187,7 @@
           <w:noProof/>
           <w:szCs w:val="20"/>
         </w:rPr>
-        <w:t>«ContactName»</w:t>
+        <w:t>«PositionTitle»</w:t>
       </w:r>
       <w:r>
         <w:rPr>
@@ -1110,25 +1203,7 @@
           <w:noProof/>
           <w:szCs w:val="20"/>
         </w:rPr>
-        <w:t>,</w:t>
-      </w:r>
-    </w:p>
-    <w:p>
-      <w:pPr>
-        <w:spacing w:after="100" w:afterAutospacing="1"/>
-        <w:rPr>
-          <w:rFonts w:ascii="Bitstream Vera Serif" w:hAnsi="Bitstream Vera Serif"/>
-          <w:noProof/>
-          <w:szCs w:val="20"/>
-        </w:rPr>
-      </w:pPr>
-      <w:r>
-        <w:rPr>
-          <w:rFonts w:ascii="Bitstream Vera Serif" w:hAnsi="Bitstream Vera Serif"/>
-          <w:noProof/>
-          <w:szCs w:val="20"/>
-        </w:rPr>
-        <w:t xml:space="preserve">We are pleased to extend to you a formal offer of employment for the position of </w:t>
+        <w:t xml:space="preserve"> in the </w:t>
       </w:r>
       <w:r>
         <w:rPr>
@@ -1144,7 +1219,7 @@
           <w:noProof/>
           <w:szCs w:val="20"/>
         </w:rPr>
-        <w:instrText xml:space="preserve"> MERGEFIELD  PositionTitle  \* MERGEFORMAT </w:instrText>
+        <w:instrText xml:space="preserve"> MERGEFIELD  DepartmentName  \* MERGEFORMAT </w:instrText>
       </w:r>
       <w:r>
         <w:rPr>
@@ -1160,7 +1235,7 @@
           <w:noProof/>
           <w:szCs w:val="20"/>
         </w:rPr>
-        <w:t>«PositionTitle»</w:t>
+        <w:t>«DepartmentName»</w:t>
       </w:r>
       <w:r>
         <w:rPr>
@@ -1176,60 +1251,13 @@
           <w:noProof/>
           <w:szCs w:val="20"/>
         </w:rPr>
-        <w:t xml:space="preserve"> in the </w:t>
-      </w:r>
-      <w:r>
-        <w:rPr>
-          <w:rFonts w:ascii="Bitstream Vera Serif" w:hAnsi="Bitstream Vera Serif"/>
-          <w:noProof/>
-          <w:szCs w:val="20"/>
-        </w:rPr>
-        <w:fldChar w:fldCharType="begin"/>
-      </w:r>
-      <w:r>
-        <w:rPr>
-          <w:rFonts w:ascii="Bitstream Vera Serif" w:hAnsi="Bitstream Vera Serif"/>
-          <w:noProof/>
-          <w:szCs w:val="20"/>
-        </w:rPr>
-        <w:instrText xml:space="preserve"> MERGEFIELD  DepartmentName  \* MERGEFORMAT </w:instrText>
-      </w:r>
-      <w:r>
-        <w:rPr>
-          <w:rFonts w:ascii="Bitstream Vera Serif" w:hAnsi="Bitstream Vera Serif"/>
-          <w:noProof/>
-          <w:szCs w:val="20"/>
-        </w:rPr>
-        <w:fldChar w:fldCharType="separate"/>
-      </w:r>
-      <w:r>
-        <w:rPr>
-          <w:rFonts w:ascii="Bitstream Vera Serif" w:hAnsi="Bitstream Vera Serif"/>
-          <w:noProof/>
-          <w:szCs w:val="20"/>
-        </w:rPr>
-        <w:t>«DepartmentName»</w:t>
-      </w:r>
-      <w:r>
-        <w:rPr>
-          <w:rFonts w:ascii="Bitstream Vera Serif" w:hAnsi="Bitstream Vera Serif"/>
-          <w:noProof/>
-          <w:szCs w:val="20"/>
-        </w:rPr>
-        <w:fldChar w:fldCharType="end"/>
-      </w:r>
-      <w:r>
-        <w:rPr>
-          <w:rFonts w:ascii="Bitstream Vera Serif" w:hAnsi="Bitstream Vera Serif"/>
-          <w:noProof/>
-          <w:szCs w:val="20"/>
-        </w:rPr>
         <w:t xml:space="preserve"> department. We are confident that your skills, experience, and qualifications will be a valuable addition to our organization.</w:t>
       </w:r>
     </w:p>
     <w:p>
       <w:pPr>
         <w:shd w:val="clear" w:color="auto" w:fill="D9D9D9" w:themeFill="background1" w:themeFillShade="D9"/>
+        <w:spacing w:before="240"/>
         <w:rPr>
           <w:rFonts w:ascii="Bitstream Vera Serif" w:hAnsi="Bitstream Vera Serif"/>
           <w:b/>
@@ -1255,7 +1283,7 @@
     </w:p>
     <w:p>
       <w:pPr>
-        <w:spacing w:before="240"/>
+        <w:spacing w:before="240" w:line="360" w:lineRule="auto"/>
         <w:rPr>
           <w:rFonts w:ascii="Bitstream Vera Serif" w:hAnsi="Bitstream Vera Serif"/>
           <w:noProof/>
@@ -1313,7 +1341,7 @@
     </w:p>
     <w:p>
       <w:pPr>
-        <w:spacing w:line="276" w:lineRule="auto"/>
+        <w:spacing w:line="360" w:lineRule="auto"/>
         <w:rPr>
           <w:rFonts w:ascii="Bitstream Vera Serif" w:hAnsi="Bitstream Vera Serif"/>
           <w:noProof/>
@@ -1371,7 +1399,7 @@
     </w:p>
     <w:p>
       <w:pPr>
-        <w:spacing w:line="276" w:lineRule="auto"/>
+        <w:spacing w:line="360" w:lineRule="auto"/>
         <w:rPr>
           <w:rFonts w:ascii="Bitstream Vera Serif" w:hAnsi="Bitstream Vera Serif"/>
           <w:noProof/>
@@ -1477,7 +1505,7 @@
     </w:p>
     <w:p>
       <w:pPr>
-        <w:spacing w:line="276" w:lineRule="auto"/>
+        <w:spacing w:line="360" w:lineRule="auto"/>
         <w:rPr>
           <w:rFonts w:ascii="Bitstream Vera Serif" w:hAnsi="Bitstream Vera Serif"/>
           <w:noProof/>
@@ -1535,7 +1563,7 @@
     </w:p>
     <w:p>
       <w:pPr>
-        <w:spacing w:line="276" w:lineRule="auto"/>
+        <w:spacing w:line="360" w:lineRule="auto"/>
         <w:rPr>
           <w:rFonts w:ascii="Bitstream Vera Serif" w:hAnsi="Bitstream Vera Serif"/>
           <w:noProof/>
@@ -1641,7 +1669,7 @@
     </w:p>
     <w:p>
       <w:pPr>
-        <w:spacing w:line="276" w:lineRule="auto"/>
+        <w:spacing w:line="360" w:lineRule="auto"/>
         <w:rPr>
           <w:rFonts w:ascii="Bitstream Vera Serif" w:hAnsi="Bitstream Vera Serif"/>
           <w:noProof/>
@@ -1699,7 +1727,7 @@
     </w:p>
     <w:p>
       <w:pPr>
-        <w:spacing w:line="276" w:lineRule="auto"/>
+        <w:spacing w:line="360" w:lineRule="auto"/>
         <w:rPr>
           <w:rFonts w:ascii="Bitstream Vera Serif" w:hAnsi="Bitstream Vera Serif"/>
           <w:noProof/>
@@ -1757,7 +1785,7 @@
     </w:p>
     <w:p>
       <w:pPr>
-        <w:spacing w:after="100" w:afterAutospacing="1"/>
+        <w:spacing w:after="100" w:afterAutospacing="1" w:line="360" w:lineRule="auto"/>
         <w:rPr>
           <w:rFonts w:ascii="Bitstream Vera Serif" w:hAnsi="Bitstream Vera Serif"/>
           <w:noProof/>
@@ -1854,7 +1882,7 @@
           <w:ilvl w:val="0"/>
           <w:numId w:val="1"/>
         </w:numPr>
-        <w:spacing w:before="240" w:after="100" w:afterAutospacing="1"/>
+        <w:spacing w:before="240" w:after="100" w:afterAutospacing="1" w:line="276" w:lineRule="auto"/>
         <w:rPr>
           <w:rFonts w:ascii="Bitstream Vera Serif" w:hAnsi="Bitstream Vera Serif"/>
           <w:noProof/>
@@ -1877,7 +1905,7 @@
           <w:ilvl w:val="0"/>
           <w:numId w:val="1"/>
         </w:numPr>
-        <w:spacing w:after="100" w:afterAutospacing="1"/>
+        <w:spacing w:after="100" w:afterAutospacing="1" w:line="360" w:lineRule="auto"/>
         <w:rPr>
           <w:rFonts w:ascii="Bitstream Vera Serif" w:hAnsi="Bitstream Vera Serif"/>
           <w:noProof/>
@@ -1941,7 +1969,7 @@
           <w:ilvl w:val="0"/>
           <w:numId w:val="1"/>
         </w:numPr>
-        <w:spacing w:after="100" w:afterAutospacing="1"/>
+        <w:spacing w:after="100" w:afterAutospacing="1" w:line="360" w:lineRule="auto"/>
         <w:rPr>
           <w:rFonts w:ascii="Bitstream Vera Serif" w:hAnsi="Bitstream Vera Serif"/>
           <w:noProof/>
@@ -2012,7 +2040,7 @@
           <w:ilvl w:val="0"/>
           <w:numId w:val="1"/>
         </w:numPr>
-        <w:spacing w:after="100" w:afterAutospacing="1"/>
+        <w:spacing w:after="100" w:afterAutospacing="1" w:line="360" w:lineRule="auto"/>
         <w:rPr>
           <w:rFonts w:ascii="Bitstream Vera Serif" w:hAnsi="Bitstream Vera Serif"/>
           <w:noProof/>
@@ -2083,7 +2111,7 @@
           <w:ilvl w:val="0"/>
           <w:numId w:val="1"/>
         </w:numPr>
-        <w:spacing w:after="100" w:afterAutospacing="1"/>
+        <w:spacing w:after="100" w:afterAutospacing="1" w:line="360" w:lineRule="auto"/>
         <w:rPr>
           <w:rFonts w:ascii="Bitstream Vera Serif" w:hAnsi="Bitstream Vera Serif"/>
           <w:noProof/>
@@ -2146,70 +2174,7 @@
           <w:ilvl w:val="0"/>
           <w:numId w:val="1"/>
         </w:numPr>
-        <w:spacing w:after="100" w:afterAutospacing="1"/>
-        <w:rPr>
-          <w:rFonts w:ascii="Bitstream Vera Serif" w:hAnsi="Bitstream Vera Serif"/>
-          <w:noProof/>
-          <w:szCs w:val="20"/>
-        </w:rPr>
-      </w:pPr>
-      <w:r>
-        <w:rPr>
-          <w:rFonts w:ascii="Bitstream Vera Serif" w:hAnsi="Bitstream Vera Serif"/>
-          <w:noProof/>
-          <w:szCs w:val="20"/>
-        </w:rPr>
-        <w:t xml:space="preserve">Professional Development: </w:t>
-      </w:r>
-      <w:r>
-        <w:rPr>
-          <w:rFonts w:ascii="Bitstream Vera Serif" w:hAnsi="Bitstream Vera Serif"/>
-          <w:noProof/>
-          <w:szCs w:val="20"/>
-        </w:rPr>
-        <w:fldChar w:fldCharType="begin"/>
-      </w:r>
-      <w:r>
-        <w:rPr>
-          <w:rFonts w:ascii="Bitstream Vera Serif" w:hAnsi="Bitstream Vera Serif"/>
-          <w:noProof/>
-          <w:szCs w:val="20"/>
-        </w:rPr>
-        <w:instrText xml:space="preserve"> MERGEFIELD  TrainingBudget  \* MERGEFORMAT </w:instrText>
-      </w:r>
-      <w:r>
-        <w:rPr>
-          <w:rFonts w:ascii="Bitstream Vera Serif" w:hAnsi="Bitstream Vera Serif"/>
-          <w:noProof/>
-          <w:szCs w:val="20"/>
-        </w:rPr>
-        <w:fldChar w:fldCharType="separate"/>
-      </w:r>
-      <w:r>
-        <w:rPr>
-          <w:rFonts w:ascii="Bitstream Vera Serif" w:hAnsi="Bitstream Vera Serif"/>
-          <w:noProof/>
-          <w:szCs w:val="20"/>
-        </w:rPr>
-        <w:t>«TrainingBudget»</w:t>
-      </w:r>
-      <w:r>
-        <w:rPr>
-          <w:rFonts w:ascii="Bitstream Vera Serif" w:hAnsi="Bitstream Vera Serif"/>
-          <w:noProof/>
-          <w:szCs w:val="20"/>
-        </w:rPr>
-        <w:fldChar w:fldCharType="end"/>
-      </w:r>
-    </w:p>
-    <w:p>
-      <w:pPr>
-        <w:pStyle w:val="ListParagraph"/>
-        <w:numPr>
-          <w:ilvl w:val="0"/>
-          <w:numId w:val="1"/>
-        </w:numPr>
-        <w:spacing w:after="100" w:afterAutospacing="1"/>
+        <w:spacing w:after="100" w:afterAutospacing="1" w:line="360" w:lineRule="auto"/>
         <w:rPr>
           <w:rFonts w:ascii="Bitstream Vera Serif" w:hAnsi="Bitstream Vera Serif"/>
           <w:noProof/>
@@ -2319,7 +2284,7 @@
           <w:ilvl w:val="0"/>
           <w:numId w:val="2"/>
         </w:numPr>
-        <w:spacing w:after="100" w:afterAutospacing="1"/>
+        <w:spacing w:line="360" w:lineRule="auto"/>
         <w:rPr>
           <w:rFonts w:ascii="Bitstream Vera Serif" w:hAnsi="Bitstream Vera Serif"/>
           <w:noProof/>
@@ -2390,7 +2355,7 @@
           <w:ilvl w:val="0"/>
           <w:numId w:val="2"/>
         </w:numPr>
-        <w:spacing w:after="100" w:afterAutospacing="1"/>
+        <w:spacing w:line="360" w:lineRule="auto"/>
         <w:rPr>
           <w:rFonts w:ascii="Bitstream Vera Serif" w:hAnsi="Bitstream Vera Serif"/>
           <w:noProof/>
@@ -2413,7 +2378,7 @@
           <w:ilvl w:val="0"/>
           <w:numId w:val="2"/>
         </w:numPr>
-        <w:spacing w:after="100" w:afterAutospacing="1"/>
+        <w:spacing w:line="360" w:lineRule="auto"/>
         <w:rPr>
           <w:rFonts w:ascii="Bitstream Vera Serif" w:hAnsi="Bitstream Vera Serif"/>
           <w:noProof/>
@@ -2484,7 +2449,7 @@
           <w:ilvl w:val="0"/>
           <w:numId w:val="2"/>
         </w:numPr>
-        <w:spacing w:after="100" w:afterAutospacing="1"/>
+        <w:spacing w:line="360" w:lineRule="auto"/>
         <w:rPr>
           <w:rFonts w:ascii="Bitstream Vera Serif" w:hAnsi="Bitstream Vera Serif"/>
           <w:noProof/>
@@ -2498,100 +2463,6 @@
           <w:szCs w:val="20"/>
         </w:rPr>
         <w:t>Confidentiality: You will maintain strict confidentiality of company information</w:t>
-      </w:r>
-    </w:p>
-    <w:p>
-      <w:pPr>
-        <w:pStyle w:val="ListParagraph"/>
-        <w:numPr>
-          <w:ilvl w:val="0"/>
-          <w:numId w:val="2"/>
-        </w:numPr>
-        <w:spacing w:after="100" w:afterAutospacing="1"/>
-        <w:rPr>
-          <w:rFonts w:ascii="Bitstream Vera Serif" w:hAnsi="Bitstream Vera Serif"/>
-          <w:noProof/>
-          <w:szCs w:val="20"/>
-        </w:rPr>
-      </w:pPr>
-      <w:r>
-        <w:rPr>
-          <w:rFonts w:ascii="Bitstream Vera Serif" w:hAnsi="Bitstream Vera Serif"/>
-          <w:noProof/>
-          <w:szCs w:val="20"/>
-        </w:rPr>
-        <w:t>Code of Conduct: Adherence to our Company Policies and Code of Conduct</w:t>
-      </w:r>
-    </w:p>
-    <w:p>
-      <w:pPr>
-        <w:pStyle w:val="ListParagraph"/>
-        <w:numPr>
-          <w:ilvl w:val="0"/>
-          <w:numId w:val="2"/>
-        </w:numPr>
-        <w:spacing w:after="100" w:afterAutospacing="1"/>
-        <w:rPr>
-          <w:rFonts w:ascii="Bitstream Vera Serif" w:hAnsi="Bitstream Vera Serif"/>
-          <w:noProof/>
-          <w:szCs w:val="20"/>
-        </w:rPr>
-      </w:pPr>
-      <w:r>
-        <w:rPr>
-          <w:rFonts w:ascii="Bitstream Vera Serif" w:hAnsi="Bitstream Vera Serif"/>
-          <w:noProof/>
-          <w:szCs w:val="20"/>
-        </w:rPr>
-        <w:t xml:space="preserve">Non-Compete Agreement: </w:t>
-      </w:r>
-      <w:r>
-        <w:rPr>
-          <w:rFonts w:ascii="Bitstream Vera Serif" w:hAnsi="Bitstream Vera Serif"/>
-          <w:noProof/>
-          <w:szCs w:val="20"/>
-        </w:rPr>
-        <w:fldChar w:fldCharType="begin"/>
-      </w:r>
-      <w:r>
-        <w:rPr>
-          <w:rFonts w:ascii="Bitstream Vera Serif" w:hAnsi="Bitstream Vera Serif"/>
-          <w:noProof/>
-          <w:szCs w:val="20"/>
-        </w:rPr>
-        <w:instrText xml:space="preserve"> MERGEFIELD  NonCompetePeriod  \* MERGEFORMAT </w:instrText>
-      </w:r>
-      <w:r>
-        <w:rPr>
-          <w:rFonts w:ascii="Bitstream Vera Serif" w:hAnsi="Bitstream Vera Serif"/>
-          <w:noProof/>
-          <w:szCs w:val="20"/>
-        </w:rPr>
-        <w:fldChar w:fldCharType="separate"/>
-      </w:r>
-      <w:r>
-        <w:rPr>
-          <w:rFonts w:ascii="Bitstream Vera Serif" w:hAnsi="Bitstream Vera Serif"/>
-          <w:noProof/>
-          <w:szCs w:val="20"/>
-        </w:rPr>
-        <w:t>«NonCompetePeriod»</w:t>
-      </w:r>
-      <w:r>
-        <w:rPr>
-          <w:rFonts w:ascii="Bitstream Vera Serif" w:hAnsi="Bitstream Vera Serif"/>
-          <w:noProof/>
-          <w:szCs w:val="20"/>
-        </w:rPr>
-        <w:fldChar w:fldCharType="end"/>
-      </w:r>
-      <w:r>
-        <w:rPr>
-          <w:rFonts w:ascii="Bitstream Vera Serif" w:hAnsi="Bitstream Vera Serif"/>
-          <w:noProof/>
-          <w:szCs w:val="20"/>
-        </w:rPr>
-        <w:t xml:space="preserve"> months (if applicable)</w:t>
       </w:r>
     </w:p>
     <w:p>
@@ -2637,7 +2508,7 @@
           <w:noProof/>
           <w:szCs w:val="20"/>
         </w:rPr>
-        <w:t xml:space="preserve">Please confirm your acceptance of this offer by signing below and returning this document to </w:t>
+        <w:t xml:space="preserve">Please sign and return this letter by </w:t>
       </w:r>
       <w:r>
         <w:rPr>
@@ -2653,7 +2524,7 @@
           <w:noProof/>
           <w:szCs w:val="20"/>
         </w:rPr>
-        <w:instrText xml:space="preserve"> MERGEFIELD  HREmail  \* MERGEFORMAT </w:instrText>
+        <w:instrText xml:space="preserve"> MERGEFIELD  AcceptanceDeadline  \* MERGEFORMAT </w:instrText>
       </w:r>
       <w:r>
         <w:rPr>
@@ -2669,7 +2540,7 @@
           <w:noProof/>
           <w:szCs w:val="20"/>
         </w:rPr>
-        <w:t>«HREmail»</w:t>
+        <w:t>«AcceptanceDeadline»</w:t>
       </w:r>
       <w:r>
         <w:rPr>
@@ -2685,61 +2556,20 @@
           <w:noProof/>
           <w:szCs w:val="20"/>
         </w:rPr>
-        <w:t xml:space="preserve"> by </w:t>
-      </w:r>
-      <w:r>
-        <w:rPr>
-          <w:rFonts w:ascii="Bitstream Vera Serif" w:hAnsi="Bitstream Vera Serif"/>
-          <w:noProof/>
-          <w:szCs w:val="20"/>
-        </w:rPr>
-        <w:fldChar w:fldCharType="begin"/>
-      </w:r>
-      <w:r>
-        <w:rPr>
-          <w:rFonts w:ascii="Bitstream Vera Serif" w:hAnsi="Bitstream Vera Serif"/>
-          <w:noProof/>
-          <w:szCs w:val="20"/>
-        </w:rPr>
-        <w:instrText xml:space="preserve"> MERGEFIELD  AcceptanceDeadline  \* MERGEFORMAT </w:instrText>
-      </w:r>
-      <w:r>
-        <w:rPr>
-          <w:rFonts w:ascii="Bitstream Vera Serif" w:hAnsi="Bitstream Vera Serif"/>
-          <w:noProof/>
-          <w:szCs w:val="20"/>
-        </w:rPr>
-        <w:fldChar w:fldCharType="separate"/>
-      </w:r>
-      <w:r>
-        <w:rPr>
-          <w:rFonts w:ascii="Bitstream Vera Serif" w:hAnsi="Bitstream Vera Serif"/>
-          <w:noProof/>
-          <w:szCs w:val="20"/>
-        </w:rPr>
-        <w:t>«AcceptanceDeadline»</w:t>
-      </w:r>
-      <w:r>
-        <w:rPr>
-          <w:rFonts w:ascii="Bitstream Vera Serif" w:hAnsi="Bitstream Vera Serif"/>
-          <w:noProof/>
-          <w:szCs w:val="20"/>
-        </w:rPr>
-        <w:fldChar w:fldCharType="end"/>
-      </w:r>
-      <w:r>
-        <w:rPr>
-          <w:rFonts w:ascii="Bitstream Vera Serif" w:hAnsi="Bitstream Vera Serif"/>
-          <w:noProof/>
-          <w:szCs w:val="20"/>
-        </w:rPr>
-        <w:t>. Upon acceptance, you agree to complete all pre-joining formalities and join us on the specified start date.Should you have any questions or concerns regarding this offer, please feel free to contact us at the above phone number, Fax, or Email.</w:t>
+        <w:t xml:space="preserve"> </w:t>
+      </w:r>
+      <w:r>
+        <w:rPr>
+          <w:rFonts w:ascii="Bitstream Vera Serif" w:hAnsi="Bitstream Vera Serif"/>
+          <w:noProof/>
+          <w:szCs w:val="20"/>
+        </w:rPr>
+        <w:t>to confirm acceptance.</w:t>
       </w:r>
     </w:p>
     <w:p>
       <w:pPr>
         <w:spacing w:after="100" w:afterAutospacing="1"/>
-        <w:jc w:val="center"/>
         <w:rPr>
           <w:rFonts w:ascii="Bitstream Vera Serif" w:hAnsi="Bitstream Vera Serif"/>
           <w:noProof/>
@@ -2859,7 +2689,8 @@
           <w:b/>
           <w:bCs/>
           <w:color w:val="0F243E" w:themeColor="text2" w:themeShade="80"/>
-          <w:szCs w:val="20"/>
+          <w:sz w:val="28"/>
+          <w:szCs w:val="28"/>
           <w:u w:val="none"/>
         </w:rPr>
       </w:pPr>
@@ -2874,19 +2705,7 @@
           <w:szCs w:val="28"/>
           <w:u w:val="none"/>
         </w:rPr>
-        <w:t>ACCEPTANCE</w:t>
-      </w:r>
-      <w:r>
-        <w:rPr>
-          <w:rStyle w:val="Hyperlink"/>
-          <w:rFonts w:ascii="Bitstream Vera Serif" w:hAnsi="Bitstream Vera Serif"/>
-          <w:b/>
-          <w:bCs/>
-          <w:color w:val="0F243E" w:themeColor="text2" w:themeShade="80"/>
-          <w:szCs w:val="20"/>
-          <w:u w:val="none"/>
-        </w:rPr>
-        <w:t xml:space="preserve"> BY CANDIDATE</w:t>
+        <w:t>ACCEPTANCE BY CANDIDATE</w:t>
       </w:r>
     </w:p>
     <w:p>
@@ -2894,23 +2713,41 @@
         <w:pStyle w:val="Signature"/>
         <w:spacing w:after="100" w:afterAutospacing="1"/>
         <w:ind w:left="0"/>
-        <w:rPr>
-          <w:rStyle w:val="Hyperlink"/>
+        <w:jc w:val="both"/>
+        <w:rPr>
           <w:rFonts w:ascii="Bitstream Vera Serif" w:hAnsi="Bitstream Vera Serif"/>
           <w:color w:val="000000" w:themeColor="text1"/>
           <w:szCs w:val="20"/>
-          <w:u w:val="none"/>
-        </w:rPr>
-      </w:pPr>
-      <w:r>
-        <w:rPr>
-          <w:rStyle w:val="Hyperlink"/>
+        </w:rPr>
+      </w:pPr>
+      <w:r>
+        <w:rPr>
           <w:rFonts w:ascii="Bitstream Vera Serif" w:hAnsi="Bitstream Vera Serif"/>
           <w:color w:val="000000" w:themeColor="text1"/>
           <w:szCs w:val="20"/>
-          <w:u w:val="none"/>
-        </w:rPr>
-        <w:t>I hereby accept the offer of employment as outlined above.</w:t>
+        </w:rPr>
+        <w:t>I hereby accept the offer of employment as outlined above and agree to abide by the terms and conditions of employment.</w:t>
+      </w:r>
+    </w:p>
+    <w:p>
+      <w:pPr>
+        <w:pStyle w:val="Signature"/>
+        <w:spacing w:after="100" w:afterAutospacing="1"/>
+        <w:ind w:left="0"/>
+        <w:jc w:val="both"/>
+        <w:rPr>
+          <w:rFonts w:ascii="Bitstream Vera Serif" w:hAnsi="Bitstream Vera Serif"/>
+          <w:color w:val="000000" w:themeColor="text1"/>
+          <w:szCs w:val="20"/>
+        </w:rPr>
+      </w:pPr>
+      <w:r>
+        <w:rPr>
+          <w:rFonts w:ascii="Bitstream Vera Serif" w:hAnsi="Bitstream Vera Serif"/>
+          <w:color w:val="000000" w:themeColor="text1"/>
+          <w:szCs w:val="20"/>
+        </w:rPr>
+        <w:t>I acknowledge that I have read and understood this letter and agree to comply with company policies.</w:t>
       </w:r>
     </w:p>
     <w:tbl>
@@ -2928,8 +2765,8 @@
         <w:tblLook w:val="04A0" w:firstRow="1" w:lastRow="0" w:firstColumn="1" w:lastColumn="0" w:noHBand="0" w:noVBand="1"/>
       </w:tblPr>
       <w:tblGrid>
-        <w:gridCol w:w="5388"/>
-        <w:gridCol w:w="4908"/>
+        <w:gridCol w:w="5272"/>
+        <w:gridCol w:w="4808"/>
       </w:tblGrid>
       <w:tr>
         <w:trPr>
@@ -3087,7 +2924,10 @@
         <w:spacing w:after="100" w:afterAutospacing="1"/>
         <w:ind w:left="0"/>
         <w:rPr>
-          <w:noProof/>
+          <w:rStyle w:val="Hyperlink"/>
+          <w:noProof/>
+          <w:color w:val="auto"/>
+          <w:u w:val="none"/>
         </w:rPr>
       </w:pPr>
       <w:fldSimple w:instr=" MERGEFIELD  EndGroup:EmployeeDetails  \* MERGEFORMAT ">
@@ -3098,18 +2938,6 @@
           <w:t>«EndGroup:EmployeeDetails»</w:t>
         </w:r>
       </w:fldSimple>
-    </w:p>
-    <w:p>
-      <w:pPr>
-        <w:pStyle w:val="Signature"/>
-        <w:spacing w:after="100" w:afterAutospacing="1"/>
-        <w:ind w:left="0"/>
-        <w:rPr>
-          <w:rStyle w:val="Hyperlink"/>
-          <w:color w:val="auto"/>
-          <w:u w:val="none"/>
-        </w:rPr>
-      </w:pPr>
     </w:p>
     <w:sectPr>
       <w:pgSz w:w="12240" w:h="15840"/>
@@ -3966,6 +3794,18 @@
       <w:lang w:eastAsia="zh-TW"/>
     </w:rPr>
   </w:style>
+  <w:style w:type="character" w:styleId="UnresolvedMention">
+    <w:name w:val="Unresolved Mention"/>
+    <w:basedOn w:val="DefaultParagraphFont"/>
+    <w:uiPriority w:val="99"/>
+    <w:semiHidden/>
+    <w:unhideWhenUsed/>
+    <w:rsid w:val="00CB2F21"/>
+    <w:rPr>
+      <w:color w:val="605E5C"/>
+      <w:shd w:val="clear" w:color="auto" w:fill="E1DFDD"/>
+    </w:rPr>
+  </w:style>
 </w:styles>
 </file>
 

</xml_diff>